<commit_message>
Update CMPS350 Web development projec. phase 1 Report.docx
</commit_message>
<xml_diff>
--- a/CMPS350 Web development projec. phase 1 Report.docx
+++ b/CMPS350 Web development projec. phase 1 Report.docx
@@ -164,7 +164,7 @@
           <w:iCs/>
           <w:sz w:val="24"/>
           <w:szCs w:val="24"/>
-          <w:lang w:val="en-QA"/>
+          <w:lang/>
         </w:rPr>
       </w:pPr>
     </w:p>
@@ -179,7 +179,7 @@
           <w:iCs/>
           <w:sz w:val="24"/>
           <w:szCs w:val="24"/>
-          <w:lang w:val="en-QA"/>
+          <w:lang/>
         </w:rPr>
       </w:pPr>
       <w:r>
@@ -189,7 +189,7 @@
           <w:iCs/>
           <w:sz w:val="24"/>
           <w:szCs w:val="24"/>
-          <w:lang w:val="en-QA"/>
+          <w:lang/>
         </w:rPr>
         <w:t>Express. Create. Inspire.</w:t>
       </w:r>
@@ -296,10 +296,13 @@
           <w:sz w:val="32"/>
           <w:szCs w:val="32"/>
         </w:rPr>
-        <w:t xml:space="preserve">Dr. </w:t>
+        <w:t>Dr. Mucahid Kutlu</w:t>
       </w:r>
-      <w:proofErr w:type="spellStart"/>
-      <w:r>
+    </w:p>
+    <w:p>
+      <w:pPr>
+        <w:bidi w:val="0"/>
+        <w:jc w:val="center"/>
         <w:rPr>
           <w:rFonts w:ascii="Times New Roman" w:hAnsi="Times New Roman" w:cs="Times New Roman"/>
           <w:b/>
@@ -307,9 +310,7 @@
           <w:sz w:val="32"/>
           <w:szCs w:val="32"/>
         </w:rPr>
-        <w:t>Mucahid</w:t>
-      </w:r>
-      <w:proofErr w:type="spellEnd"/>
+      </w:pPr>
       <w:r>
         <w:rPr>
           <w:rFonts w:ascii="Times New Roman" w:hAnsi="Times New Roman" w:cs="Times New Roman"/>
@@ -318,7 +319,7 @@
           <w:sz w:val="32"/>
           <w:szCs w:val="32"/>
         </w:rPr>
-        <w:t xml:space="preserve"> Kutlu</w:t>
+        <w:t>Section - L52</w:t>
       </w:r>
     </w:p>
     <w:p>
@@ -333,29 +334,6 @@
           <w:szCs w:val="32"/>
         </w:rPr>
       </w:pPr>
-      <w:r>
-        <w:rPr>
-          <w:rFonts w:ascii="Times New Roman" w:hAnsi="Times New Roman" w:cs="Times New Roman"/>
-          <w:b/>
-          <w:bCs/>
-          <w:sz w:val="32"/>
-          <w:szCs w:val="32"/>
-        </w:rPr>
-        <w:t>Section - L52</w:t>
-      </w:r>
-    </w:p>
-    <w:p>
-      <w:pPr>
-        <w:bidi w:val="0"/>
-        <w:jc w:val="center"/>
-        <w:rPr>
-          <w:rFonts w:ascii="Times New Roman" w:hAnsi="Times New Roman" w:cs="Times New Roman"/>
-          <w:b/>
-          <w:bCs/>
-          <w:sz w:val="32"/>
-          <w:szCs w:val="32"/>
-        </w:rPr>
-      </w:pPr>
     </w:p>
     <w:p>
       <w:pPr>
@@ -400,29 +378,7 @@
           <w:sz w:val="28"/>
           <w:szCs w:val="28"/>
         </w:rPr>
-        <w:t xml:space="preserve">                       </w:t>
-      </w:r>
-      <w:proofErr w:type="spellStart"/>
-      <w:r>
-        <w:rPr>
-          <w:rFonts w:ascii="Times New Roman" w:hAnsi="Times New Roman" w:cs="Times New Roman"/>
-          <w:b/>
-          <w:bCs/>
-          <w:sz w:val="28"/>
-          <w:szCs w:val="28"/>
-        </w:rPr>
-        <w:t>Mahajuba</w:t>
-      </w:r>
-      <w:proofErr w:type="spellEnd"/>
-      <w:r>
-        <w:rPr>
-          <w:rFonts w:ascii="Times New Roman" w:hAnsi="Times New Roman" w:cs="Times New Roman"/>
-          <w:b/>
-          <w:bCs/>
-          <w:sz w:val="28"/>
-          <w:szCs w:val="28"/>
-        </w:rPr>
-        <w:t xml:space="preserve"> Rahman</w:t>
+        <w:t xml:space="preserve">                       Mahajuba Rahman</w:t>
       </w:r>
       <w:r>
         <w:rPr>
@@ -487,27 +443,7 @@
           <w:sz w:val="28"/>
           <w:szCs w:val="28"/>
         </w:rPr>
-        <w:t xml:space="preserve">                          </w:t>
-      </w:r>
-      <w:r>
-        <w:rPr>
-          <w:rFonts w:ascii="Times New Roman" w:hAnsi="Times New Roman" w:cs="Times New Roman"/>
-          <w:b/>
-          <w:bCs/>
-          <w:sz w:val="28"/>
-          <w:szCs w:val="28"/>
-        </w:rPr>
-        <w:t xml:space="preserve">Ashley Danoy    </w:t>
-      </w:r>
-      <w:r>
-        <w:rPr>
-          <w:rFonts w:ascii="Times New Roman" w:hAnsi="Times New Roman" w:cs="Times New Roman"/>
-          <w:b/>
-          <w:bCs/>
-          <w:sz w:val="28"/>
-          <w:szCs w:val="28"/>
-        </w:rPr>
-        <w:t xml:space="preserve">        </w:t>
+        <w:t xml:space="preserve">                          Ashley Danoy            </w:t>
       </w:r>
       <w:r>
         <w:rPr>
@@ -562,7 +498,7 @@
           <w:sz w:val="28"/>
           <w:szCs w:val="28"/>
         </w:rPr>
-        <w:t xml:space="preserve">                        </w:t>
+        <w:t xml:space="preserve">                        Jawairia Ahmed  </w:t>
       </w:r>
       <w:r>
         <w:rPr>
@@ -572,38 +508,7 @@
           <w:sz w:val="28"/>
           <w:szCs w:val="28"/>
         </w:rPr>
-        <w:t xml:space="preserve">Jawairia </w:t>
-      </w:r>
-      <w:proofErr w:type="gramStart"/>
-      <w:r>
-        <w:rPr>
-          <w:rFonts w:ascii="Times New Roman" w:hAnsi="Times New Roman" w:cs="Times New Roman"/>
-          <w:b/>
-          <w:bCs/>
-          <w:sz w:val="28"/>
-          <w:szCs w:val="28"/>
-        </w:rPr>
-        <w:t xml:space="preserve">Ahmed  </w:t>
-      </w:r>
-      <w:r>
-        <w:rPr>
-          <w:rFonts w:ascii="Times New Roman" w:hAnsi="Times New Roman" w:cs="Times New Roman"/>
-          <w:b/>
-          <w:bCs/>
-          <w:sz w:val="28"/>
-          <w:szCs w:val="28"/>
-        </w:rPr>
         <w:tab/>
-      </w:r>
-      <w:proofErr w:type="gramEnd"/>
-      <w:r>
-        <w:rPr>
-          <w:rFonts w:ascii="Times New Roman" w:hAnsi="Times New Roman" w:cs="Times New Roman"/>
-          <w:b/>
-          <w:bCs/>
-          <w:sz w:val="28"/>
-          <w:szCs w:val="28"/>
-        </w:rPr>
         <w:t xml:space="preserve">      </w:t>
       </w:r>
       <w:r>
@@ -728,7 +633,7 @@
           <w:kern w:val="2"/>
           <w:szCs w:val="24"/>
           <w:rtl/>
-          <w:lang w:val="en-QA"/>
+          <w:lang/>
           <w14:ligatures w14:val="standardContextual"/>
         </w:rPr>
       </w:pPr>
@@ -754,11 +659,13 @@
     <w:sdt>
       <w:sdtPr>
         <w:rPr>
-          <w:rFonts w:ascii="Times New Roman" w:hAnsi="Times New Roman" w:cs="Times New Roman"/>
+          <w:rFonts w:ascii="Times New Roman" w:eastAsiaTheme="minorHAnsi" w:hAnsi="Times New Roman" w:cs="Times New Roman"/>
           <w:b/>
           <w:bCs/>
           <w:noProof/>
           <w:color w:val="000000" w:themeColor="text1"/>
+          <w:sz w:val="22"/>
+          <w:szCs w:val="22"/>
         </w:rPr>
         <w:id w:val="162901900"/>
         <w:docPartObj>
@@ -768,10 +675,7 @@
       </w:sdtPr>
       <w:sdtEndPr>
         <w:rPr>
-          <w:rFonts w:eastAsiaTheme="minorHAnsi"/>
           <w:color w:val="auto"/>
-          <w:sz w:val="22"/>
-          <w:szCs w:val="22"/>
           <w:rtl/>
         </w:rPr>
       </w:sdtEndPr>
@@ -812,7 +716,7 @@
               <w:sz w:val="30"/>
               <w:szCs w:val="30"/>
               <w:rtl/>
-              <w:lang w:val="en-QA"/>
+              <w:lang/>
               <w14:ligatures w14:val="standardContextual"/>
             </w:rPr>
           </w:pPr>
@@ -855,7 +759,7 @@
                 <w:kern w:val="2"/>
                 <w:sz w:val="30"/>
                 <w:szCs w:val="30"/>
-                <w:lang w:val="en-QA"/>
+                <w:lang/>
                 <w14:ligatures w14:val="standardContextual"/>
               </w:rPr>
               <w:t xml:space="preserve">    </w:t>
@@ -868,57 +772,7 @@
                 <w:sz w:val="30"/>
                 <w:szCs w:val="30"/>
               </w:rPr>
-              <w:t>P</w:t>
-            </w:r>
-            <w:r>
-              <w:rPr>
-                <w:rStyle w:val="Hyperlink"/>
-                <w:rFonts w:ascii="Times New Roman" w:hAnsi="Times New Roman" w:cs="Times New Roman"/>
-                <w:noProof/>
-                <w:sz w:val="30"/>
-                <w:szCs w:val="30"/>
-              </w:rPr>
-              <w:t>ro</w:t>
-            </w:r>
-            <w:r>
-              <w:rPr>
-                <w:rStyle w:val="Hyperlink"/>
-                <w:rFonts w:ascii="Times New Roman" w:hAnsi="Times New Roman" w:cs="Times New Roman"/>
-                <w:noProof/>
-                <w:sz w:val="30"/>
-                <w:szCs w:val="30"/>
-              </w:rPr>
-              <w:t>j</w:t>
-            </w:r>
-            <w:r>
-              <w:rPr>
-                <w:rStyle w:val="Hyperlink"/>
-                <w:rFonts w:ascii="Times New Roman" w:hAnsi="Times New Roman" w:cs="Times New Roman"/>
-                <w:noProof/>
-                <w:sz w:val="30"/>
-                <w:szCs w:val="30"/>
-              </w:rPr>
-              <w:t>ec</w:t>
-            </w:r>
-            <w:r>
-              <w:rPr>
-                <w:rStyle w:val="Hyperlink"/>
-                <w:rFonts w:ascii="Times New Roman" w:hAnsi="Times New Roman" w:cs="Times New Roman"/>
-                <w:noProof/>
-                <w:sz w:val="30"/>
-                <w:szCs w:val="30"/>
-              </w:rPr>
-              <w:t>t</w:t>
-            </w:r>
-            <w:r>
-              <w:rPr>
-                <w:rStyle w:val="Hyperlink"/>
-                <w:rFonts w:ascii="Times New Roman" w:hAnsi="Times New Roman" w:cs="Times New Roman"/>
-                <w:noProof/>
-                <w:sz w:val="30"/>
-                <w:szCs w:val="30"/>
-              </w:rPr>
-              <w:t xml:space="preserve"> Overview</w:t>
+              <w:t>Project Overview</w:t>
             </w:r>
             <w:r>
               <w:rPr>
@@ -1049,7 +903,7 @@
               <w:sz w:val="30"/>
               <w:szCs w:val="30"/>
               <w:rtl/>
-              <w:lang w:val="en-QA"/>
+              <w:lang/>
               <w14:ligatures w14:val="standardContextual"/>
             </w:rPr>
           </w:pPr>
@@ -1071,7 +925,7 @@
                 <w:kern w:val="2"/>
                 <w:sz w:val="30"/>
                 <w:szCs w:val="30"/>
-                <w:lang w:val="en-QA"/>
+                <w:lang/>
                 <w14:ligatures w14:val="standardContextual"/>
               </w:rPr>
               <w:t xml:space="preserve">  </w:t>
@@ -1215,7 +1069,7 @@
               <w:sz w:val="30"/>
               <w:szCs w:val="30"/>
               <w:rtl/>
-              <w:lang w:val="en-QA"/>
+              <w:lang/>
               <w14:ligatures w14:val="standardContextual"/>
             </w:rPr>
           </w:pPr>
@@ -1237,7 +1091,7 @@
                 <w:kern w:val="2"/>
                 <w:sz w:val="30"/>
                 <w:szCs w:val="30"/>
-                <w:lang w:val="en-QA"/>
+                <w:lang/>
                 <w14:ligatures w14:val="standardContextual"/>
               </w:rPr>
               <w:t xml:space="preserve">  </w:t>
@@ -1250,27 +1104,7 @@
                 <w:sz w:val="30"/>
                 <w:szCs w:val="30"/>
               </w:rPr>
-              <w:t>Quic</w:t>
-            </w:r>
-            <w:r>
-              <w:rPr>
-                <w:rStyle w:val="Hyperlink"/>
-                <w:rFonts w:ascii="Times New Roman" w:hAnsi="Times New Roman" w:cs="Times New Roman"/>
-                <w:noProof/>
-                <w:sz w:val="30"/>
-                <w:szCs w:val="30"/>
-              </w:rPr>
-              <w:t>k</w:t>
-            </w:r>
-            <w:r>
-              <w:rPr>
-                <w:rStyle w:val="Hyperlink"/>
-                <w:rFonts w:ascii="Times New Roman" w:hAnsi="Times New Roman" w:cs="Times New Roman"/>
-                <w:noProof/>
-                <w:sz w:val="30"/>
-                <w:szCs w:val="30"/>
-              </w:rPr>
-              <w:t xml:space="preserve"> Guide</w:t>
+              <w:t>Quick Guide</w:t>
             </w:r>
             <w:r>
               <w:rPr>
@@ -1401,7 +1235,7 @@
               <w:sz w:val="30"/>
               <w:szCs w:val="30"/>
               <w:rtl/>
-              <w:lang w:val="en-QA"/>
+              <w:lang/>
               <w14:ligatures w14:val="standardContextual"/>
             </w:rPr>
           </w:pPr>
@@ -1423,7 +1257,7 @@
                 <w:kern w:val="2"/>
                 <w:sz w:val="30"/>
                 <w:szCs w:val="30"/>
-                <w:lang w:val="en-QA"/>
+                <w:lang/>
                 <w14:ligatures w14:val="standardContextual"/>
               </w:rPr>
               <w:t xml:space="preserve">  </w:t>
@@ -1583,7 +1417,7 @@
           <w:rFonts w:ascii="Times New Roman" w:hAnsi="Times New Roman" w:cs="Times New Roman"/>
           <w:noProof/>
           <w:rtl/>
-          <w:lang w:val="en-QA"/>
+          <w:lang/>
         </w:rPr>
       </w:pPr>
     </w:p>
@@ -1778,23 +1612,13 @@
           <w:szCs w:val="24"/>
         </w:rPr>
       </w:pPr>
-      <w:proofErr w:type="spellStart"/>
       <w:r>
         <w:rPr>
           <w:rFonts w:ascii="Times New Roman" w:hAnsi="Times New Roman" w:cs="Times New Roman"/>
           <w:sz w:val="24"/>
           <w:szCs w:val="24"/>
         </w:rPr>
-        <w:t>Creativo</w:t>
-      </w:r>
-      <w:proofErr w:type="spellEnd"/>
-      <w:r>
-        <w:rPr>
-          <w:rFonts w:ascii="Times New Roman" w:hAnsi="Times New Roman" w:cs="Times New Roman"/>
-          <w:sz w:val="24"/>
-          <w:szCs w:val="24"/>
-        </w:rPr>
-        <w:t xml:space="preserve"> is a web-based platform designed to bring creative individuals together in one simple, interactive space. The idea behind the project is to provide users with a place where they can share their thoughts, ideas, and creative content, whether it is poetry, short stories, art concepts, or even simple prompts for inspiration</w:t>
+        <w:t>Creativo is a web-based platform designed to bring creative individuals together in one simple, interactive space. The idea behind the project is to provide users with a place where they can share their thoughts, ideas, and creative content, whether it is poetry, short stories, art concepts, or even simple prompts for inspiration</w:t>
       </w:r>
       <w:r>
         <w:rPr>
@@ -1884,25 +1708,7 @@
           <w:sz w:val="24"/>
           <w:szCs w:val="24"/>
         </w:rPr>
-        <w:t xml:space="preserve">The design of </w:t>
-      </w:r>
-      <w:proofErr w:type="spellStart"/>
-      <w:r>
-        <w:rPr>
-          <w:rFonts w:ascii="Times New Roman" w:hAnsi="Times New Roman" w:cs="Times New Roman"/>
-          <w:sz w:val="24"/>
-          <w:szCs w:val="24"/>
-        </w:rPr>
-        <w:t>Creativo</w:t>
-      </w:r>
-      <w:proofErr w:type="spellEnd"/>
-      <w:r>
-        <w:rPr>
-          <w:rFonts w:ascii="Times New Roman" w:hAnsi="Times New Roman" w:cs="Times New Roman"/>
-          <w:sz w:val="24"/>
-          <w:szCs w:val="24"/>
-        </w:rPr>
-        <w:t xml:space="preserve"> also plays an important role. The interface follows a clean and modern aesthetic, with a consistent color palette and typography that reflects a creative and expressive environment. The goal was not only to make the system functional, but also visually appealing and comfortable to use</w:t>
+        <w:t>The design of Creativo also plays an important role. The interface follows a clean and modern aesthetic, with a consistent color palette and typography that reflects a creative and expressive environment. The goal was not only to make the system functional, but also visually appealing and comfortable to use</w:t>
       </w:r>
       <w:r>
         <w:rPr>
@@ -2875,23 +2681,7 @@
                 <w:sz w:val="24"/>
                 <w:szCs w:val="24"/>
               </w:rPr>
-              <w:t xml:space="preserve">UI exists but functionality </w:t>
-            </w:r>
-            <w:r>
-              <w:rPr>
-                <w:rFonts w:ascii="Times New Roman" w:eastAsia="Times New Roman" w:hAnsi="Times New Roman" w:cs="Times New Roman"/>
-                <w:sz w:val="24"/>
-                <w:szCs w:val="24"/>
-              </w:rPr>
-              <w:t>it is still</w:t>
-            </w:r>
-            <w:r>
-              <w:rPr>
-                <w:rFonts w:ascii="Times New Roman" w:eastAsia="Times New Roman" w:hAnsi="Times New Roman" w:cs="Times New Roman"/>
-                <w:sz w:val="24"/>
-                <w:szCs w:val="24"/>
-              </w:rPr>
-              <w:t xml:space="preserve"> limited</w:t>
+              <w:t>UI exists but functionality it is still limited</w:t>
             </w:r>
           </w:p>
         </w:tc>
@@ -3143,23 +2933,7 @@
                 <w:sz w:val="24"/>
                 <w:szCs w:val="24"/>
               </w:rPr>
-              <w:t xml:space="preserve">UI present but logic may </w:t>
-            </w:r>
-            <w:r>
-              <w:rPr>
-                <w:rFonts w:ascii="Times New Roman" w:eastAsia="Times New Roman" w:hAnsi="Times New Roman" w:cs="Times New Roman"/>
-                <w:sz w:val="24"/>
-                <w:szCs w:val="24"/>
-              </w:rPr>
-              <w:t>is not</w:t>
-            </w:r>
-            <w:r>
-              <w:rPr>
-                <w:rFonts w:ascii="Times New Roman" w:eastAsia="Times New Roman" w:hAnsi="Times New Roman" w:cs="Times New Roman"/>
-                <w:sz w:val="24"/>
-                <w:szCs w:val="24"/>
-              </w:rPr>
-              <w:t xml:space="preserve"> fully functional</w:t>
+              <w:t>UI present but logic may is not fully functional</w:t>
             </w:r>
           </w:p>
         </w:tc>
@@ -3237,6 +3011,14 @@
                 <w:szCs w:val="24"/>
               </w:rPr>
             </w:pPr>
+            <w:r>
+              <w:rPr>
+                <w:rFonts w:ascii="Times New Roman" w:eastAsia="Times New Roman" w:hAnsi="Times New Roman" w:cs="Times New Roman"/>
+                <w:sz w:val="24"/>
+                <w:szCs w:val="24"/>
+              </w:rPr>
+              <w:t>Users can delete their own posts, which are removed from the feed and local storage. </w:t>
+            </w:r>
           </w:p>
         </w:tc>
       </w:tr>
@@ -3265,7 +3047,7 @@
                 <w:sz w:val="24"/>
                 <w:szCs w:val="24"/>
               </w:rPr>
-              <w:t>Delete/Edit Post</w:t>
+              <w:t>Edit Post</w:t>
             </w:r>
           </w:p>
         </w:tc>
@@ -3459,6 +3241,7 @@
       <w:r>
         <w:rPr>
           <w:rFonts w:ascii="Times New Roman" w:eastAsia="Times New Roman" w:hAnsi="Times New Roman" w:cs="Times New Roman"/>
+          <w:noProof/>
           <w:sz w:val="24"/>
           <w:szCs w:val="24"/>
         </w:rPr>
@@ -3538,40 +3321,23 @@
           <w:sz w:val="24"/>
           <w:szCs w:val="24"/>
         </w:rPr>
-        <w:t xml:space="preserve">Using </w:t>
+        <w:t>Using Creativo is designed to be simple and straightforward. The user journey starts from account creation and continues into exploring and sharing content.</w:t>
       </w:r>
-      <w:proofErr w:type="spellStart"/>
-      <w:r>
+    </w:p>
+    <w:p>
+      <w:pPr>
+        <w:bidi w:val="0"/>
+        <w:spacing w:before="100" w:beforeAutospacing="1" w:after="100" w:afterAutospacing="1" w:line="360" w:lineRule="auto"/>
         <w:rPr>
           <w:rFonts w:ascii="Times New Roman" w:eastAsia="Times New Roman" w:hAnsi="Times New Roman" w:cs="Times New Roman"/>
           <w:sz w:val="24"/>
           <w:szCs w:val="24"/>
         </w:rPr>
-        <w:t>Creativo</w:t>
-      </w:r>
-      <w:proofErr w:type="spellEnd"/>
+      </w:pPr>
       <w:r>
         <w:rPr>
           <w:rFonts w:ascii="Times New Roman" w:eastAsia="Times New Roman" w:hAnsi="Times New Roman" w:cs="Times New Roman"/>
-          <w:sz w:val="24"/>
-          <w:szCs w:val="24"/>
-        </w:rPr>
-        <w:t xml:space="preserve"> is designed to be simple and straightforward. The user journey starts from account creation and continues into exploring and sharing content.</w:t>
-      </w:r>
-    </w:p>
-    <w:p>
-      <w:pPr>
-        <w:bidi w:val="0"/>
-        <w:spacing w:before="100" w:beforeAutospacing="1" w:after="100" w:afterAutospacing="1" w:line="360" w:lineRule="auto"/>
-        <w:rPr>
-          <w:rFonts w:ascii="Times New Roman" w:eastAsia="Times New Roman" w:hAnsi="Times New Roman" w:cs="Times New Roman"/>
-          <w:sz w:val="24"/>
-          <w:szCs w:val="24"/>
-        </w:rPr>
-      </w:pPr>
-      <w:r>
-        <w:rPr>
-          <w:rFonts w:ascii="Times New Roman" w:eastAsia="Times New Roman" w:hAnsi="Times New Roman" w:cs="Times New Roman"/>
+          <w:noProof/>
           <w:sz w:val="24"/>
           <w:szCs w:val="24"/>
         </w:rPr>
@@ -3722,6 +3488,7 @@
       <w:r>
         <w:rPr>
           <w:rFonts w:ascii="Times New Roman" w:eastAsia="Times New Roman" w:hAnsi="Times New Roman" w:cs="Times New Roman"/>
+          <w:noProof/>
           <w:sz w:val="24"/>
           <w:szCs w:val="24"/>
         </w:rPr>
@@ -3828,6 +3595,7 @@
       <w:r>
         <w:rPr>
           <w:rFonts w:ascii="Times New Roman" w:eastAsia="Times New Roman" w:hAnsi="Times New Roman" w:cs="Times New Roman"/>
+          <w:noProof/>
           <w:sz w:val="24"/>
           <w:szCs w:val="24"/>
         </w:rPr>
@@ -3943,6 +3711,7 @@
       <w:r>
         <w:rPr>
           <w:rFonts w:ascii="Times New Roman" w:eastAsia="Times New Roman" w:hAnsi="Times New Roman" w:cs="Times New Roman"/>
+          <w:noProof/>
           <w:sz w:val="24"/>
           <w:szCs w:val="24"/>
         </w:rPr>
@@ -4090,6 +3859,7 @@
       <w:r>
         <w:rPr>
           <w:rFonts w:ascii="Times New Roman" w:eastAsia="Times New Roman" w:hAnsi="Times New Roman" w:cs="Times New Roman"/>
+          <w:noProof/>
           <w:sz w:val="24"/>
           <w:szCs w:val="24"/>
         </w:rPr>
@@ -4481,11 +4251,6 @@
         <w:docPartUnique/>
       </w:docPartObj>
     </w:sdtPr>
-    <w:sdtEndPr>
-      <w:rPr>
-        <w:rStyle w:val="PageNumber"/>
-      </w:rPr>
-    </w:sdtEndPr>
     <w:sdtContent>
       <w:p>
         <w:pPr>
@@ -4542,11 +4307,6 @@
         <w:docPartUnique/>
       </w:docPartObj>
     </w:sdtPr>
-    <w:sdtEndPr>
-      <w:rPr>
-        <w:rStyle w:val="PageNumber"/>
-      </w:rPr>
-    </w:sdtEndPr>
     <w:sdtContent>
       <w:p>
         <w:pPr>
@@ -8148,7 +7908,6 @@
   <w:style w:type="character" w:default="1" w:styleId="DefaultParagraphFont">
     <w:name w:val="Default Paragraph Font"/>
     <w:uiPriority w:val="1"/>
-    <w:semiHidden/>
     <w:unhideWhenUsed/>
   </w:style>
   <w:style w:type="table" w:default="1" w:styleId="TableNormal">

</xml_diff>